<commit_message>
Fixed login UI and label visibility
</commit_message>
<xml_diff>
--- a/AUN NAZAMI_timetable.docx
+++ b/AUN NAZAMI_timetable.docx
@@ -239,7 +239,11 @@
             <w:tcW w:type="dxa" w:w="1530"/>
           </w:tcPr>
           <w:p>
-            <w:r/>
+            <w:r>
+              <w:t>7C</w:t>
+              <w:br/>
+              <w:t>ISLAMIAT</w:t>
+            </w:r>
           </w:p>
         </w:tc>
         <w:tc>
@@ -250,7 +254,7 @@
             <w:r>
               <w:t>7C</w:t>
               <w:br/>
-              <w:t>ISLAMIAT</w:t>
+              <w:t>ARABIC</w:t>
             </w:r>
           </w:p>
         </w:tc>
@@ -431,11 +435,7 @@
             <w:tcW w:type="dxa" w:w="1530"/>
           </w:tcPr>
           <w:p>
-            <w:r>
-              <w:t>7C</w:t>
-              <w:br/>
-              <w:t>ARABIC</w:t>
-            </w:r>
+            <w:r/>
           </w:p>
         </w:tc>
         <w:tc>

</xml_diff>